<commit_message>
Expand references to 18 sources and fix citation ordering
Adds eight sources addressing real gaps: Cliff (1993) and Vargha &
Delaney (2000) for the effect-size statistics already computed but
never attributed, Arcuri & Briand (2011) for statistical-testing
practice in software engineering, Chilimbi/Hill/Larus (1999) and
Drepper (2007) for the cache-locality claim behind the traversal
ratio, Sandve et al. (2013) and Peng (2011) for the reproducibility
framing, and Astrachan (2003) for the empirical-measurement teaching
argument in Section 5.3.

Reference numbering is now computed from a single ordered REFERENCES
list keyed by citation, fixing a latent bug where Section 3.2 cited
[9]/[10] before Section 3.5's [8] despite appearing later in reading
order.
</commit_message>
<xml_diff>
--- a/paper/Beyond_Big_O_Mac_Pilot_Study_Draft.docx
+++ b/paper/Beyond_Big_O_Mac_Pilot_Study_Draft.docx
@@ -407,7 +407,7 @@
           <w:color w:val="0B2545"/>
           <w:sz w:val="22"/>
         </w:rPr>
-        <w:t>Performance measurement is vulnerable to effects that are easy to overlook. Mytkowicz et al. showed that apparently harmless environmental changes can alter conclusions [4]. Georges et al. and Kalibera and Jones argued for warm-ups, repeated measurements, uncertainty reporting and explicit treatment of runtime-system variability [5,6]. Fleming and Wallace further cautioned that benchmark summaries can mislead when inappropriate averages are used [7]. The present pilot therefore prioritises medians, dispersion, warm-ups, immutable raw results and correctness checks.</w:t>
+        <w:t>Performance measurement is vulnerable to effects that are easy to overlook. Mytkowicz et al. showed that apparently harmless environmental changes can alter conclusions [4]. Georges et al. and Kalibera and Jones argued for warm-ups, repeated measurements, uncertainty reporting and explicit treatment of runtime-system variability [5,6]. Arcuri and Briand outlined complementary statistical-testing practice for evaluating randomized algorithms in software engineering, including effect-size reporting alongside significance testing [7]. Fleming and Wallace further cautioned that benchmark summaries can mislead when inappropriate averages are used [8]. Reproducibility itself depends on preserving code, data and environment details rather than reporting summary numbers alone [9,10]. The present pilot therefore prioritises medians, dispersion, warm-ups, immutable raw results and correctness checks.</w:t>
       </w:r>
     </w:p>
     <w:p>
@@ -1078,7 +1078,7 @@
           <w:color w:val="0B2545"/>
           <w:sz w:val="22"/>
         </w:rPr>
-        <w:t>The experiment used three abstract structures. The dynamic-array condition used Python list [9] and C++ std::vector&lt;int&gt; [10]; the linked condition used a custom Python singly linked list and C++ std::list&lt;int&gt;; and the hash condition used Python dict and C++ std::unordered_map&lt;int,int&gt;. Inputs contained unique integers in a deterministic shuffled order.</w:t>
+        <w:t>The experiment used three abstract structures. The dynamic-array condition used Python list [11] and C++ std::vector&lt;int&gt; [12]; the linked condition used a custom Python singly linked list and C++ std::list&lt;int&gt;; and the hash condition used Python dict and C++ std::unordered_map&lt;int,int&gt;. Inputs contained unique integers in a deterministic shuffled order.</w:t>
       </w:r>
     </w:p>
     <w:p>
@@ -1679,7 +1679,7 @@
           <w:color w:val="0B2545"/>
           <w:sz w:val="22"/>
         </w:rPr>
-        <w:t>The primary summary was the median across ten repetitions, with the mean, standard deviation and non-parametric bootstrap interval retained in the generated analysis file [8]. Coefficient of variation (CV) was used to describe group dispersion. Python-to-C++ median ratios at n = 25,000 were calculated descriptively; Cliff's delta was also computed. Scaling exponents between n = 5,000 and n = 25,000 were estimated as log(T2/T1) / log(n2/n1). No causal language claim is made because language and container representation were not independently manipulated.</w:t>
+        <w:t>The primary summary was the median across ten repetitions, with the mean, standard deviation and non-parametric bootstrap interval retained in the generated analysis file [13]. Coefficient of variation (CV) was used to describe group dispersion. Python-to-C++ median ratios at n = 25,000 were calculated descriptively; Cliff's delta [14], following the A-measure formulation of Vargha and Delaney [15], was also computed. Scaling exponents between n = 5,000 and n = 25,000 were estimated as log(T2/T1) / log(n2/n1). No causal language claim is made because language and container representation were not independently manipulated.</w:t>
       </w:r>
     </w:p>
     <w:p>
@@ -4666,7 +4666,7 @@
           <w:color w:val="0B2545"/>
           <w:sz w:val="22"/>
         </w:rPr>
-        <w:t>The Python/C++ differences include many inseparable factors: interpretation versus optimized native code, boxed Python integers versus C++ primitive integers, object allocation, iterator implementation and library design. The largest ratio occurred for contiguous traversal, where optimized native loops can exploit compact primitive storage and compiler transformations. Hash insertion and deletion showed smaller ratios, indicating that language overhead is not a single constant applied uniformly to every structure and operation.</w:t>
+        <w:t>The Python/C++ differences include many inseparable factors: interpretation versus optimized native code, boxed Python integers versus C++ primitive integers, object allocation, iterator implementation and library design. The largest ratio occurred for contiguous traversal, where optimized native loops can exploit compact primitive storage, spatial locality and compiler transformations that pointer-chasing and boxed representations largely defeat [16,17]. Hash insertion and deletion showed smaller ratios, indicating that language overhead is not a single constant applied uniformly to every structure and operation.</w:t>
       </w:r>
     </w:p>
     <w:p>
@@ -4692,7 +4692,7 @@
           <w:color w:val="0B2545"/>
           <w:sz w:val="22"/>
         </w:rPr>
-        <w:t>A useful teaching sequence is therefore: predict complexity, define the entire workload, implement correctness checks, measure, and then explain both agreement and disagreement. Students should learn to ask not only 'What is the Big-O?' but also 'What exactly is repeated, what representation is used, what is inside the timed region, and is the measurement long enough for the clock?' The repository makes those questions visible and reproducible.</w:t>
+        <w:t>A useful teaching sequence is therefore: predict complexity, define the entire workload, implement correctness checks, measure, and then explain both agreement and disagreement. Students should learn to ask not only 'What is the Big-O?' but also 'What exactly is repeated, what representation is used, what is inside the timed region, and is the measurement long enough for the clock?' This echoes earlier calls in computing education to pair algorithmic analysis with empirical measurement rather than treating asymptotic notation as a substitute for it [18]. The repository makes those questions visible and reproducible.</w:t>
       </w:r>
     </w:p>
     <w:p>
@@ -5002,6 +5002,23 @@
           <w:color w:val="0B2545"/>
           <w:sz w:val="19"/>
         </w:rPr>
+        <w:t>Arcuri, A., and Briand, L. (2011). A practical guide for using statistical tests to assess randomized algorithms in software engineering. Proceedings of ICSE 2011, 1-10. https://doi.org/10.1145/1985793.1985795</w:t>
+      </w:r>
+    </w:p>
+    <w:p>
+      <w:pPr>
+        <w:pStyle w:val="ListNumber"/>
+        <w:spacing w:after="100" w:line="276" w:lineRule="auto"/>
+        <w:ind w:left="504" w:hanging="360"/>
+      </w:pPr>
+      <w:r>
+        <w:rPr>
+          <w:rFonts w:ascii="Calibri" w:hAnsi="Calibri"/>
+          <w:b w:val="0"/>
+          <w:i w:val="0"/>
+          <w:color w:val="0B2545"/>
+          <w:sz w:val="19"/>
+        </w:rPr>
         <w:t>Fleming, P. J., and Wallace, J. J. (1986). How not to lie with statistics: the correct way to summarize benchmark results. Communications of the ACM, 29(3), 218-221. https://doi.org/10.1145/5666.5673</w:t>
       </w:r>
     </w:p>
@@ -5019,7 +5036,24 @@
           <w:color w:val="0B2545"/>
           <w:sz w:val="19"/>
         </w:rPr>
-        <w:t>Efron, B., and Tibshirani, R. J. (1993). An Introduction to the Bootstrap. Chapman and Hall/CRC.</w:t>
+        <w:t>Sandve, G. K., Nekrutenko, A., Taylor, J., and Hovig, E. (2013). Ten simple rules for reproducible computational research. PLOS Computational Biology, 9(10), e1003285. https://doi.org/10.1371/journal.pcbi.1003285</w:t>
+      </w:r>
+    </w:p>
+    <w:p>
+      <w:pPr>
+        <w:pStyle w:val="ListNumber"/>
+        <w:spacing w:after="100" w:line="276" w:lineRule="auto"/>
+        <w:ind w:left="504" w:hanging="360"/>
+      </w:pPr>
+      <w:r>
+        <w:rPr>
+          <w:rFonts w:ascii="Calibri" w:hAnsi="Calibri"/>
+          <w:b w:val="0"/>
+          <w:i w:val="0"/>
+          <w:color w:val="0B2545"/>
+          <w:sz w:val="19"/>
+        </w:rPr>
+        <w:t>Peng, R. D. (2011). Reproducible research in computational science. Science, 334(6060), 1226-1227. https://doi.org/10.1126/science.1213847</w:t>
       </w:r>
     </w:p>
     <w:p>
@@ -5054,6 +5088,108 @@
           <w:sz w:val="19"/>
         </w:rPr>
         <w:t>ISO/IEC. (2020). ISO/IEC 14882:2020 Programming Languages - C++. International Organization for Standardization.</w:t>
+      </w:r>
+    </w:p>
+    <w:p>
+      <w:pPr>
+        <w:pStyle w:val="ListNumber"/>
+        <w:spacing w:after="100" w:line="276" w:lineRule="auto"/>
+        <w:ind w:left="504" w:hanging="360"/>
+      </w:pPr>
+      <w:r>
+        <w:rPr>
+          <w:rFonts w:ascii="Calibri" w:hAnsi="Calibri"/>
+          <w:b w:val="0"/>
+          <w:i w:val="0"/>
+          <w:color w:val="0B2545"/>
+          <w:sz w:val="19"/>
+        </w:rPr>
+        <w:t>Efron, B., and Tibshirani, R. J. (1993). An Introduction to the Bootstrap. Chapman and Hall/CRC.</w:t>
+      </w:r>
+    </w:p>
+    <w:p>
+      <w:pPr>
+        <w:pStyle w:val="ListNumber"/>
+        <w:spacing w:after="100" w:line="276" w:lineRule="auto"/>
+        <w:ind w:left="504" w:hanging="360"/>
+      </w:pPr>
+      <w:r>
+        <w:rPr>
+          <w:rFonts w:ascii="Calibri" w:hAnsi="Calibri"/>
+          <w:b w:val="0"/>
+          <w:i w:val="0"/>
+          <w:color w:val="0B2545"/>
+          <w:sz w:val="19"/>
+        </w:rPr>
+        <w:t>Cliff, N. (1993). Dominance statistics: Ordinal analyses to answer ordinal questions. Psychological Bulletin, 114(3), 494-509. https://doi.org/10.1037/0033-2909.114.3.494</w:t>
+      </w:r>
+    </w:p>
+    <w:p>
+      <w:pPr>
+        <w:pStyle w:val="ListNumber"/>
+        <w:spacing w:after="100" w:line="276" w:lineRule="auto"/>
+        <w:ind w:left="504" w:hanging="360"/>
+      </w:pPr>
+      <w:r>
+        <w:rPr>
+          <w:rFonts w:ascii="Calibri" w:hAnsi="Calibri"/>
+          <w:b w:val="0"/>
+          <w:i w:val="0"/>
+          <w:color w:val="0B2545"/>
+          <w:sz w:val="19"/>
+        </w:rPr>
+        <w:t>Vargha, A., and Delaney, H. D. (2000). A critique and improvement of the CL common language effect size statistics of McGraw and Wong. Journal of Educational and Behavioral Statistics, 25(2), 101-132. https://doi.org/10.3102/10769986025002101</w:t>
+      </w:r>
+    </w:p>
+    <w:p>
+      <w:pPr>
+        <w:pStyle w:val="ListNumber"/>
+        <w:spacing w:after="100" w:line="276" w:lineRule="auto"/>
+        <w:ind w:left="504" w:hanging="360"/>
+      </w:pPr>
+      <w:r>
+        <w:rPr>
+          <w:rFonts w:ascii="Calibri" w:hAnsi="Calibri"/>
+          <w:b w:val="0"/>
+          <w:i w:val="0"/>
+          <w:color w:val="0B2545"/>
+          <w:sz w:val="19"/>
+        </w:rPr>
+        <w:t>Chilimbi, T. M., Hill, M. D., and Larus, J. R. (1999). Cache-conscious structure layout. Proceedings of PLDI 1999, 1-12. https://doi.org/10.1145/301618.301633</w:t>
+      </w:r>
+    </w:p>
+    <w:p>
+      <w:pPr>
+        <w:pStyle w:val="ListNumber"/>
+        <w:spacing w:after="100" w:line="276" w:lineRule="auto"/>
+        <w:ind w:left="504" w:hanging="360"/>
+      </w:pPr>
+      <w:r>
+        <w:rPr>
+          <w:rFonts w:ascii="Calibri" w:hAnsi="Calibri"/>
+          <w:b w:val="0"/>
+          <w:i w:val="0"/>
+          <w:color w:val="0B2545"/>
+          <w:sz w:val="19"/>
+        </w:rPr>
+        <w:t>Drepper, U. (2007). What Every Programmer Should Know About Memory. Red Hat, Inc.</w:t>
+      </w:r>
+    </w:p>
+    <w:p>
+      <w:pPr>
+        <w:pStyle w:val="ListNumber"/>
+        <w:spacing w:after="100" w:line="276" w:lineRule="auto"/>
+        <w:ind w:left="504" w:hanging="360"/>
+      </w:pPr>
+      <w:r>
+        <w:rPr>
+          <w:rFonts w:ascii="Calibri" w:hAnsi="Calibri"/>
+          <w:b w:val="0"/>
+          <w:i w:val="0"/>
+          <w:color w:val="0B2545"/>
+          <w:sz w:val="19"/>
+        </w:rPr>
+        <w:t>Astrachan, O. (2003). Bubble sort: an archaeological algorithmic analysis. ACM SIGCSE Bulletin, 35(1), 1-5. https://doi.org/10.1145/611892.611918</w:t>
       </w:r>
     </w:p>
     <w:p>

</xml_diff>

<commit_message>
Reframe Conclusion: lead with what closed, box the rest as future scope
Restructures the closing paragraph of Section 7 (build_paper.py) /
VII (IJACSA) so it leads with a confident, quantified claim -- "closed
four of the six original future-work items" -- and treats the
distribution-sensitivity result as a finding in its own right rather
than an apologetic caveat. The three remaining open items (mutating-
operation batching, independent-system reproduction, literal cache
counters) move into a clearly labeled "Future scope" note instead of
being folded into the same paragraph as the achievements, so the two
are visually and rhetorically separated. No factual claims changed.

Also ignores Word's transient ~$*.docx lock files.

Co-Authored-By: Claude Sonnet 5 <noreply@anthropic.com>
</commit_message>
<xml_diff>
--- a/paper/Beyond_Big_O_Mac_Pilot_Study_Draft.docx
+++ b/paper/Beyond_Big_O_Mac_Pilot_Study_Draft.docx
@@ -11190,7 +11190,34 @@
           <w:color w:val="0B2545"/>
           <w:sz w:val="22"/>
         </w:rPr>
-        <w:t>Within a single Mac's reach, this revision closed four of the original future-work items: Section 4.6 added Java, Section 4.7 resolved the sub-microsecond timing caveat for read-only operations, and Section 4.8 added peak memory, two coarse hardware counters, a thermal/power snapshot and a second input-distribution family. Two items remain genuinely out of reach on this machine and are not restated here as actionable tasks: literal L1/L2/L3 cache hit and miss counts require Linux perf, and no claim here has been checked against an independent second system (Section 6.3). What remains Mac-feasible but undone is batching the mutating insert and delete operations -- harder than the read-only case since it requires rebuilding the container between batches -- and made more pressing by Section 4.8's finding that C++ insertion, unlike search, deletion and traversal, differs substantially and unexplainedly between the two input distributions tested. Those extensions should be reported as new evidence, not combined silently with the present Mac data.</w:t>
+        <w:t>This revision closed four of the six original future-work items within a single Mac's reach: Section 4.6 added Java as a third language; Section 4.7 resolved the sub-microsecond timing caveat for read-only operations through calibrated batching; and Section 4.8 added peak memory, two coarse hardware counters, a thermal/power snapshot and a second input-distribution family -- the last of which surfaced a genuine new finding, that C++ insertion, unlike search, deletion and traversal, responds substantially to input order.</w:t>
+      </w:r>
+    </w:p>
+    <w:p>
+      <w:pPr>
+        <w:spacing w:before="80" w:after="160" w:line="300" w:lineRule="auto"/>
+        <w:ind w:left="216" w:right="216"/>
+        <w:shd w:fill="E8EEF5"/>
+      </w:pPr>
+      <w:r>
+        <w:rPr>
+          <w:rFonts w:ascii="Calibri" w:hAnsi="Calibri"/>
+          <w:b/>
+          <w:i w:val="0"/>
+          <w:color w:val="1F4D78"/>
+          <w:sz w:val="22"/>
+        </w:rPr>
+        <w:t xml:space="preserve">Future scope: </w:t>
+      </w:r>
+      <w:r>
+        <w:rPr>
+          <w:rFonts w:ascii="Calibri" w:hAnsi="Calibri"/>
+          <w:b w:val="0"/>
+          <w:i w:val="0"/>
+          <w:color w:val="0B2545"/>
+          <w:sz w:val="22"/>
+        </w:rPr>
+        <w:t>Three extensions define the next study rather than this one's shortfall: batching the mutating insert and delete operations to explain the input-order sensitivity Section 4.8 surfaced -- harder than the read-only case, since it requires rebuilding the container between batches; reproducing this protocol on an independent second system; and measuring literal L1/L2/L3 cache hit and miss counts, which require Linux perf and are unavailable on this Mac. Each should be reported as new evidence, not combined silently with the present data.</w:t>
       </w:r>
     </w:p>
     <w:p>

</xml_diff>

<commit_message>
Add a Plain-Language Summary for non-specialist readers
Places a jargon-free, bulleted explanation of the paper's findings
right after the Abstract/Keywords and before the Introduction, aimed
at readers outside computer science. In build_paper.py it's an
unnumbered heading; in the IJACSA version it uses the same unnumbered
"Heading 5" style already used for Acknowledgment/Declarations, so it
does not shift the template's auto-numbered Roman-numeral/lettered
section sequence that later text cross-references by number (Section
IV-F, VI-B, etc.). Verified: citations still 1-18 correct in both
documents, "I. Introduction" still opens the numbered sequence
immediately after the new section in the IJACSA rendering, tests pass.

Co-Authored-By: Claude Sonnet 5 <noreply@anthropic.com>
</commit_message>
<xml_diff>
--- a/paper/Beyond_Big_O_Mac_Pilot_Study_Draft.docx
+++ b/paper/Beyond_Big_O_Mac_Pilot_Study_Draft.docx
@@ -159,6 +159,140 @@
           <w:sz w:val="22"/>
         </w:rPr>
         <w:t>data structures; Big-O; empirical algorithmics; Python; C++; Java; microbenchmarking; reproducibility; construct validity</w:t>
+      </w:r>
+    </w:p>
+    <w:p>
+      <w:pPr>
+        <w:pStyle w:val="Heading1"/>
+        <w:keepNext/>
+      </w:pPr>
+      <w:r>
+        <w:t>Plain-Language Summary</w:t>
+      </w:r>
+    </w:p>
+    <w:p>
+      <w:pPr>
+        <w:keepNext w:val="0"/>
+        <w:spacing w:before="0" w:after="160" w:line="320" w:lineRule="auto"/>
+        <w:jc w:val="both"/>
+      </w:pPr>
+      <w:r>
+        <w:rPr>
+          <w:rFonts w:ascii="Calibri" w:hAnsi="Calibri"/>
+          <w:b w:val="0"/>
+          <w:i w:val="0"/>
+          <w:color w:val="0B2545"/>
+          <w:sz w:val="22"/>
+        </w:rPr>
+        <w:t>The rest of this paper is written for a computer science audience. This section explains the same findings in everyday language.</w:t>
+      </w:r>
+    </w:p>
+    <w:p>
+      <w:pPr>
+        <w:pStyle w:val="ListBullet"/>
+        <w:spacing w:after="80" w:line="290" w:lineRule="auto"/>
+        <w:ind w:left="540" w:hanging="279"/>
+        <w:jc w:val="left"/>
+      </w:pPr>
+      <w:r>
+        <w:rPr>
+          <w:rFonts w:ascii="Calibri" w:hAnsi="Calibri"/>
+          <w:b w:val="0"/>
+          <w:i w:val="0"/>
+          <w:color w:val="0B2545"/>
+          <w:sz w:val="22"/>
+        </w:rPr>
+        <w:t>The "speed rules" taught in computer science classes turned out to be accurate: searching and deleting got slower in exactly the pattern theory predicts as the data grew, and hash-table lookups stayed fast.</w:t>
+      </w:r>
+    </w:p>
+    <w:p>
+      <w:pPr>
+        <w:pStyle w:val="ListBullet"/>
+        <w:spacing w:after="80" w:line="290" w:lineRule="auto"/>
+        <w:ind w:left="540" w:hanging="279"/>
+        <w:jc w:val="left"/>
+      </w:pPr>
+      <w:r>
+        <w:rPr>
+          <w:rFonts w:ascii="Calibri" w:hAnsi="Calibri"/>
+          <w:b w:val="0"/>
+          <w:i w:val="0"/>
+          <w:color w:val="0B2545"/>
+          <w:sz w:val="22"/>
+        </w:rPr>
+        <w:t>C++ was consistently faster than Python, but not by one fixed number -- how much faster depended heavily on the specific task.</w:t>
+      </w:r>
+    </w:p>
+    <w:p>
+      <w:pPr>
+        <w:pStyle w:val="ListBullet"/>
+        <w:spacing w:after="80" w:line="290" w:lineRule="auto"/>
+        <w:ind w:left="540" w:hanging="279"/>
+        <w:jc w:val="left"/>
+      </w:pPr>
+      <w:r>
+        <w:rPr>
+          <w:rFonts w:ascii="Calibri" w:hAnsi="Calibri"/>
+          <w:b w:val="0"/>
+          <w:i w:val="0"/>
+          <w:color w:val="0B2545"/>
+          <w:sz w:val="22"/>
+        </w:rPr>
+        <w:t>Java held a surprise: on 4 of the 12 tasks tested, it was actually slower than Python, and its speed bounced around from run to run far more than Python's or C++'s did.</w:t>
+      </w:r>
+    </w:p>
+    <w:p>
+      <w:pPr>
+        <w:pStyle w:val="ListBullet"/>
+        <w:spacing w:after="80" w:line="290" w:lineRule="auto"/>
+        <w:ind w:left="540" w:hanging="279"/>
+        <w:jc w:val="left"/>
+      </w:pPr>
+      <w:r>
+        <w:rPr>
+          <w:rFonts w:ascii="Calibri" w:hAnsi="Calibri"/>
+          <w:b w:val="0"/>
+          <w:i w:val="0"/>
+          <w:color w:val="0B2545"/>
+          <w:sz w:val="22"/>
+        </w:rPr>
+        <w:t>A few C++ operations finished faster than the computer's own stopwatch could reliably measure. Running each one thousands of times in a row and averaging the result solved this.</w:t>
+      </w:r>
+    </w:p>
+    <w:p>
+      <w:pPr>
+        <w:pStyle w:val="ListBullet"/>
+        <w:spacing w:after="80" w:line="290" w:lineRule="auto"/>
+        <w:ind w:left="540" w:hanging="279"/>
+        <w:jc w:val="left"/>
+      </w:pPr>
+      <w:r>
+        <w:rPr>
+          <w:rFonts w:ascii="Calibri" w:hAnsi="Calibri"/>
+          <w:b w:val="0"/>
+          <w:i w:val="0"/>
+          <w:color w:val="0B2545"/>
+          <w:sz w:val="22"/>
+        </w:rPr>
+        <w:t>The most interesting new discovery: for almost every operation, it did not matter whether the data started out shuffled or already sorted -- the speed was about the same either way. The one exception was inserting data into a C++ container, where the speed changed noticeably depending on the input order, and the reason is not yet known. That is reported honestly as an open question rather than guessed at.</w:t>
+      </w:r>
+    </w:p>
+    <w:p>
+      <w:pPr>
+        <w:pStyle w:val="ListBullet"/>
+        <w:spacing w:after="80" w:line="290" w:lineRule="auto"/>
+        <w:ind w:left="540" w:hanging="279"/>
+        <w:jc w:val="left"/>
+      </w:pPr>
+      <w:r>
+        <w:rPr>
+          <w:rFonts w:ascii="Calibri" w:hAnsi="Calibri"/>
+          <w:b w:val="0"/>
+          <w:i w:val="0"/>
+          <w:color w:val="0B2545"/>
+          <w:sz w:val="22"/>
+        </w:rPr>
+        <w:t>Two things are left for a follow-up study: testing this on a second, different computer, and taking more detailed processor-level measurements. Both need equipment beyond the single laptop used here.</w:t>
       </w:r>
     </w:p>
     <w:p>

</xml_diff>